<commit_message>
docs: edit paper phase 1 report section 5, 6, 7, 10
</commit_message>
<xml_diff>
--- a/Documentation/Papers/Phase1_Discovery_Report_Version1.docx
+++ b/Documentation/Papers/Phase1_Discovery_Report_Version1.docx
@@ -10354,7 +10354,25 @@
           <w:sz w:val="22"/>
           <w:szCs w:val="24"/>
         </w:rPr>
-        <w:t>Because this project uses time-series data, random splitting will be strictly avoided to prevent data leakage. The primary strategy will be a Time-Based Split, where data from 2010–2022 serves as the training set and data from 2023–2025 serves as the test set, simulating a real-world forecasting scenario. Walk-Forward Validation will additionally be considered during hyperparameter tuning to evaluate model stability across distinct market regimes, including the COVID-19 period and subsequent geopolitical volatility cycles.</w:t>
+        <w:t xml:space="preserve">Because this project uses time-series data, random splitting will be strictly avoided to prevent data leakage. The primary strategy will be a Time-Based Split, where data from </w:t>
+      </w:r>
+      <w:r>
+        <w:rPr>
+          <w:rFonts w:ascii="CMU Serif Roman" w:hAnsi="CMU Serif Roman" w:cs="CMU Serif Roman"/>
+          <w:color w:val="000000" w:themeColor="text1"/>
+          <w:sz w:val="22"/>
+          <w:szCs w:val="24"/>
+        </w:rPr>
+        <w:t>199</w:t>
+      </w:r>
+      <w:r>
+        <w:rPr>
+          <w:rFonts w:ascii="CMU Serif Roman" w:hAnsi="CMU Serif Roman" w:cs="CMU Serif Roman"/>
+          <w:color w:val="000000" w:themeColor="text1"/>
+          <w:sz w:val="22"/>
+          <w:szCs w:val="24"/>
+        </w:rPr>
+        <w:t>0–2022 serves as the training set and data from 2023–2025 serves as the test set, simulating a real-world forecasting scenario. Walk-Forward Validation will additionally be considered during hyperparameter tuning to evaluate model stability across distinct market regimes, including the COVID-19 period and subsequent geopolitical volatility cycles.</w:t>
       </w:r>
     </w:p>
     <w:p>
@@ -11118,7 +11136,25 @@
           <w:sz w:val="22"/>
           <w:szCs w:val="24"/>
         </w:rPr>
-        <w:t>The project uses data covering the period from 2010 to the end of 2025 (January 1, 2010, to December 31, 2025). The data sources are as follows:</w:t>
+        <w:t xml:space="preserve">The project uses data covering the period from </w:t>
+      </w:r>
+      <w:r>
+        <w:rPr>
+          <w:rFonts w:ascii="CMU Serif Roman" w:hAnsi="CMU Serif Roman"/>
+          <w:color w:val="000000" w:themeColor="text1"/>
+          <w:sz w:val="22"/>
+          <w:szCs w:val="24"/>
+        </w:rPr>
+        <w:t>1990</w:t>
+      </w:r>
+      <w:r>
+        <w:rPr>
+          <w:rFonts w:ascii="CMU Serif Roman" w:hAnsi="CMU Serif Roman"/>
+          <w:color w:val="000000" w:themeColor="text1"/>
+          <w:sz w:val="22"/>
+          <w:szCs w:val="24"/>
+        </w:rPr>
+        <w:t xml:space="preserve"> to the end of 2025 (January 1, 2010, to December 31, 2025). The data sources are as follows:</w:t>
       </w:r>
     </w:p>
     <w:p>

</xml_diff>